<commit_message>
Demo workspace: a mix of contracts and states per client; Reset the demo in Settings
Each client has its own contracts (NDAs with their own asks, supplier agreements with their own
names and addresses, their paper, order forms) in different states: in progress, closed,
archived, with past dates. Reset the demo in Settings resets only the demo workspace and keeps
the AI settings.

Co-Authored-By: Claude Opus 5.5 <noreply@anthropic.com>
</commit_message>
<xml_diff>
--- a/data/demo-files/Acme-Mutual-NDA-v0-we-sent.docx
+++ b/data/demo-files/Acme-Mutual-NDA-v0-we-sent.docx
@@ -23,7 +23,7 @@
         <w:jc w:val="both"/>
       </w:pPr>
       <w:r>
-        <w:t xml:space="preserve">This Agreement is made between PortSwigger Ltd, a company registered in England and Wales ("PortSwigger"), and Acme Analytics Ltd, a Delaware corporation whose principal office is at 200 Harbor Drive, Boston, Massachusetts ("Acme").</w:t>
+        <w:t xml:space="preserve">This Agreement is made between PortSwigger Ltd, a company registered in England and Wales ("PortSwigger"), and Acme Analytics Ltd, a company registered in England and Wales whose registered office is at 12 Canal Street, Manchester ("Acme").</w:t>
       </w:r>
     </w:p>
     <w:p>
@@ -401,7 +401,7 @@
         <w:jc w:val="both"/>
       </w:pPr>
       <w:r>
-        <w:t xml:space="preserve">Signed for and on behalf of PortSwigger Ltd by [Authorised Signatory], Director. Signed for and on behalf of Acme Analytics Ltd by Dana Whitfield, General Counsel.</w:t>
+        <w:t xml:space="preserve">Signed for and on behalf of PortSwigger Ltd by [Authorised Signatory], Director. Signed for and on behalf of Acme Analytics Ltd by Lena Brandt, General Counsel.</w:t>
       </w:r>
     </w:p>
     <w:sectPr>

</xml_diff>